<commit_message>
release: prepara DeTec Server 0.1.12
</commit_message>
<xml_diff>
--- a/docs/manuais/manual_operacao_servidor_detec.docx
+++ b/docs/manuais/manual_operacao_servidor_detec.docx
@@ -74,7 +74,7 @@
               <w:rPr>
                 <w:color w:val="26364A"/>
               </w:rPr>
-              <w:t>Edição 2.0 • Atualizado em 11/08/2026 • DeTec Server 0.1.11 • DeTec PDV 0.1.10</w:t>
+              <w:t>Edição 2.0 • Atualizado em 11/08/2026 • DeTec Server 0.1.12 • DeTec PDV 0.1.10</w:t>
             </w:r>
           </w:p>
         </w:tc>
@@ -1391,6 +1391,505 @@
       </w:pPr>
     </w:p>
     <w:p>
+      <w:pPr>
+        <w:pStyle w:val="Heading2"/>
+        <w:keepNext/>
+      </w:pPr>
+      <w:r>
+        <w:t>Liberar o acesso na rede interna</w:t>
+      </w:r>
+    </w:p>
+    <w:p>
+      <w:r>
+        <w:t>Execute como administrador e substitua Ethernet pelo nome real do adaptador, quando necessário. Use somente o IPv4 privado do adaptador com gateway; ignore Loopback, VPN, TEF e adaptadores fiscais.</w:t>
+      </w:r>
+    </w:p>
+    <w:tbl>
+      <w:tblPr>
+        <w:tblW w:type="dxa" w:w="9360"/>
+        <w:jc w:val="center"/>
+        <w:tblLayout w:type="fixed"/>
+        <w:tblLook w:firstColumn="1" w:firstRow="1" w:lastColumn="0" w:lastRow="0" w:noHBand="0" w:noVBand="1" w:val="04A0"/>
+      </w:tblPr>
+      <w:tblGrid>
+        <w:gridCol w:w="9360"/>
+      </w:tblGrid>
+      <w:tr>
+        <w:tc>
+          <w:tcPr>
+            <w:tcW w:type="dxa" w:w="9360"/>
+            <w:shd w:fill="F2F4F7"/>
+            <w:tcMar>
+              <w:top w:w="110" w:type="dxa"/>
+              <w:left w:w="150" w:type="dxa"/>
+              <w:bottom w:w="110" w:type="dxa"/>
+              <w:right w:w="150" w:type="dxa"/>
+            </w:tcMar>
+          </w:tcPr>
+          <w:p>
+            <w:pPr>
+              <w:spacing w:after="0"/>
+            </w:pPr>
+            <w:r>
+              <w:rPr>
+                <w:rFonts w:ascii="Consolas" w:hAnsi="Consolas"/>
+                <w:color w:val="1F2937"/>
+                <w:sz w:val="17"/>
+              </w:rPr>
+              <w:t>$interface = "Ethernet"</w:t>
+            </w:r>
+            <w:r>
+              <w:br/>
+            </w:r>
+            <w:r>
+              <w:rPr>
+                <w:rFonts w:ascii="Consolas" w:hAnsi="Consolas"/>
+                <w:color w:val="1F2937"/>
+                <w:sz w:val="17"/>
+              </w:rPr>
+              <w:t>$porta = 8001</w:t>
+            </w:r>
+            <w:r>
+              <w:br/>
+            </w:r>
+            <w:r>
+              <w:rPr>
+                <w:rFonts w:ascii="Consolas" w:hAnsi="Consolas"/>
+                <w:color w:val="1F2937"/>
+                <w:sz w:val="17"/>
+              </w:rPr>
+              <w:t>Set-NetConnectionProfile -InterfaceAlias $interface -NetworkCategory Private</w:t>
+            </w:r>
+            <w:r>
+              <w:br/>
+            </w:r>
+            <w:r>
+              <w:rPr>
+                <w:rFonts w:ascii="Consolas" w:hAnsi="Consolas"/>
+                <w:color w:val="1F2937"/>
+                <w:sz w:val="17"/>
+              </w:rPr>
+              <w:t>$regra = "DeTec Server - rede privada - porta $porta"</w:t>
+            </w:r>
+            <w:r>
+              <w:br/>
+            </w:r>
+            <w:r>
+              <w:rPr>
+                <w:rFonts w:ascii="Consolas" w:hAnsi="Consolas"/>
+                <w:color w:val="1F2937"/>
+                <w:sz w:val="17"/>
+              </w:rPr>
+              <w:t>Get-NetFirewallRule -DisplayName $regra -ErrorAction SilentlyContinue | Remove-NetFirewallRule</w:t>
+            </w:r>
+            <w:r>
+              <w:br/>
+            </w:r>
+            <w:r>
+              <w:rPr>
+                <w:rFonts w:ascii="Consolas" w:hAnsi="Consolas"/>
+                <w:color w:val="1F2937"/>
+                <w:sz w:val="17"/>
+              </w:rPr>
+              <w:t>New-NetFirewallRule -DisplayName $regra -Direction Inbound -Action Allow -Protocol TCP -LocalPort $porta -Profile Private -RemoteAddress LocalSubnet</w:t>
+            </w:r>
+            <w:r>
+              <w:br/>
+            </w:r>
+            <w:r>
+              <w:rPr>
+                <w:rFonts w:ascii="Consolas" w:hAnsi="Consolas"/>
+                <w:color w:val="1F2937"/>
+                <w:sz w:val="17"/>
+              </w:rPr>
+              <w:t>Restart-Service DeigoVarejoServidorLocal</w:t>
+            </w:r>
+            <w:r>
+              <w:br/>
+            </w:r>
+            <w:r>
+              <w:rPr>
+                <w:rFonts w:ascii="Consolas" w:hAnsi="Consolas"/>
+                <w:color w:val="1F2937"/>
+                <w:sz w:val="17"/>
+              </w:rPr>
+              <w:t>Get-Service DeigoVarejoServidorLocal</w:t>
+            </w:r>
+          </w:p>
+        </w:tc>
+      </w:tr>
+    </w:tbl>
+    <w:p>
+      <w:pPr>
+        <w:spacing w:after="0"/>
+      </w:pPr>
+    </w:p>
+    <w:p>
+      <w:r>
+        <w:t>Teste primeiro no servidor e depois em outro computador da mesma rede:</w:t>
+      </w:r>
+    </w:p>
+    <w:tbl>
+      <w:tblPr>
+        <w:tblW w:type="dxa" w:w="9360"/>
+        <w:jc w:val="center"/>
+        <w:tblLayout w:type="fixed"/>
+        <w:tblLook w:firstColumn="1" w:firstRow="1" w:lastColumn="0" w:lastRow="0" w:noHBand="0" w:noVBand="1" w:val="04A0"/>
+      </w:tblPr>
+      <w:tblGrid>
+        <w:gridCol w:w="9360"/>
+      </w:tblGrid>
+      <w:tr>
+        <w:tc>
+          <w:tcPr>
+            <w:tcW w:type="dxa" w:w="9360"/>
+            <w:shd w:fill="F2F4F7"/>
+            <w:tcMar>
+              <w:top w:w="110" w:type="dxa"/>
+              <w:left w:w="150" w:type="dxa"/>
+              <w:bottom w:w="110" w:type="dxa"/>
+              <w:right w:w="150" w:type="dxa"/>
+            </w:tcMar>
+          </w:tcPr>
+          <w:p>
+            <w:pPr>
+              <w:spacing w:after="0"/>
+            </w:pPr>
+            <w:r>
+              <w:rPr>
+                <w:rFonts w:ascii="Consolas" w:hAnsi="Consolas"/>
+                <w:color w:val="1F2937"/>
+                <w:sz w:val="17"/>
+              </w:rPr>
+              <w:t>Invoke-WebRequest http://IP_DO_SERVIDOR:8001/login/ -UseBasicParsing</w:t>
+            </w:r>
+            <w:r>
+              <w:br/>
+            </w:r>
+            <w:r>
+              <w:rPr>
+                <w:rFonts w:ascii="Consolas" w:hAnsi="Consolas"/>
+                <w:color w:val="1F2937"/>
+                <w:sz w:val="17"/>
+              </w:rPr>
+              <w:t>Test-NetConnection IP_DO_SERVIDOR -Port 8001</w:t>
+            </w:r>
+          </w:p>
+        </w:tc>
+      </w:tr>
+    </w:tbl>
+    <w:p>
+      <w:pPr>
+        <w:spacing w:after="0"/>
+      </w:pPr>
+    </w:p>
+    <w:tbl>
+      <w:tblPr>
+        <w:tblW w:type="dxa" w:w="9360"/>
+        <w:jc w:val="center"/>
+        <w:tblLayout w:type="fixed"/>
+        <w:tblLook w:firstColumn="1" w:firstRow="1" w:lastColumn="0" w:lastRow="0" w:noHBand="0" w:noVBand="1" w:val="04A0"/>
+      </w:tblPr>
+      <w:tblGrid>
+        <w:gridCol w:w="9360"/>
+      </w:tblGrid>
+      <w:tr>
+        <w:tc>
+          <w:tcPr>
+            <w:tcW w:type="dxa" w:w="9360"/>
+            <w:shd w:fill="FFF4E5"/>
+            <w:tcMar>
+              <w:top w:w="130" w:type="dxa"/>
+              <w:left w:w="170" w:type="dxa"/>
+              <w:bottom w:w="130" w:type="dxa"/>
+              <w:right w:w="170" w:type="dxa"/>
+            </w:tcMar>
+          </w:tcPr>
+          <w:p>
+            <w:r>
+              <w:rPr>
+                <w:b/>
+                <w:color w:val="A85A00"/>
+              </w:rPr>
+              <w:t>Endereço incorreto</w:t>
+              <w:br/>
+            </w:r>
+            <w:r>
+              <w:rPr>
+                <w:color w:val="26364A"/>
+              </w:rPr>
+              <w:t>Um IP de adaptador Loopback, VPN, TEF ou fiscal pode responder apenas localmente e não representa a rede da loja. Escolha o IPv4 privado do Ethernet/Wi-Fi que possui gateway.</w:t>
+            </w:r>
+          </w:p>
+        </w:tc>
+      </w:tr>
+    </w:tbl>
+    <w:p>
+      <w:pPr>
+        <w:spacing w:after="0"/>
+      </w:pPr>
+    </w:p>
+    <w:p>
+      <w:pPr>
+        <w:pStyle w:val="Heading2"/>
+        <w:keepNext/>
+      </w:pPr>
+      <w:r>
+        <w:t>HTTPS e acesso remoto</w:t>
+      </w:r>
+    </w:p>
+    <w:p>
+      <w:r>
+        <w:t>Não exponha a porta 8001 diretamente à internet. Para produção, publique um nome DNS próprio por proxy reverso HTTPS, como Caddy, ou use uma VPN/túnel corporativo. O proxy recebe HTTPS na porta 443 e encaminha internamente para 127.0.0.1:8001.</w:t>
+      </w:r>
+    </w:p>
+    <w:tbl>
+      <w:tblPr>
+        <w:tblW w:type="dxa" w:w="9360"/>
+        <w:jc w:val="center"/>
+        <w:tblLayout w:type="fixed"/>
+        <w:tblLook w:firstColumn="1" w:firstRow="1" w:lastColumn="0" w:lastRow="0" w:noHBand="0" w:noVBand="1" w:val="04A0"/>
+      </w:tblPr>
+      <w:tblGrid>
+        <w:gridCol w:w="9360"/>
+      </w:tblGrid>
+      <w:tr>
+        <w:tc>
+          <w:tcPr>
+            <w:tcW w:type="dxa" w:w="9360"/>
+            <w:shd w:fill="F2F4F7"/>
+            <w:tcMar>
+              <w:top w:w="110" w:type="dxa"/>
+              <w:left w:w="150" w:type="dxa"/>
+              <w:bottom w:w="110" w:type="dxa"/>
+              <w:right w:w="150" w:type="dxa"/>
+            </w:tcMar>
+          </w:tcPr>
+          <w:p>
+            <w:pPr>
+              <w:spacing w:after="0"/>
+            </w:pPr>
+            <w:r>
+              <w:rPr>
+                <w:rFonts w:ascii="Consolas" w:hAnsi="Consolas"/>
+                <w:color w:val="1F2937"/>
+                <w:sz w:val="17"/>
+              </w:rPr>
+              <w:t>erp.exemplo.com.br {</w:t>
+            </w:r>
+            <w:r>
+              <w:br/>
+            </w:r>
+            <w:r>
+              <w:rPr>
+                <w:rFonts w:ascii="Consolas" w:hAnsi="Consolas"/>
+                <w:color w:val="1F2937"/>
+                <w:sz w:val="17"/>
+              </w:rPr>
+              <w:t xml:space="preserve">    reverse_proxy 127.0.0.1:8001</w:t>
+            </w:r>
+            <w:r>
+              <w:br/>
+            </w:r>
+            <w:r>
+              <w:rPr>
+                <w:rFonts w:ascii="Consolas" w:hAnsi="Consolas"/>
+                <w:color w:val="1F2937"/>
+                <w:sz w:val="17"/>
+              </w:rPr>
+              <w:t xml:space="preserve">    encode zstd gzip</w:t>
+            </w:r>
+            <w:r>
+              <w:br/>
+            </w:r>
+            <w:r>
+              <w:rPr>
+                <w:rFonts w:ascii="Consolas" w:hAnsi="Consolas"/>
+                <w:color w:val="1F2937"/>
+                <w:sz w:val="17"/>
+              </w:rPr>
+              <w:t>}</w:t>
+            </w:r>
+          </w:p>
+        </w:tc>
+      </w:tr>
+    </w:tbl>
+    <w:p>
+      <w:pPr>
+        <w:spacing w:after="0"/>
+      </w:pPr>
+    </w:p>
+    <w:p>
+      <w:r>
+        <w:t>Depois que o domínio e o proxy estiverem validados, configure o ambiente e reinicie o serviço:</w:t>
+      </w:r>
+    </w:p>
+    <w:tbl>
+      <w:tblPr>
+        <w:tblW w:type="dxa" w:w="9360"/>
+        <w:jc w:val="center"/>
+        <w:tblLayout w:type="fixed"/>
+        <w:tblLook w:firstColumn="1" w:firstRow="1" w:lastColumn="0" w:lastRow="0" w:noHBand="0" w:noVBand="1" w:val="04A0"/>
+      </w:tblPr>
+      <w:tblGrid>
+        <w:gridCol w:w="9360"/>
+      </w:tblGrid>
+      <w:tr>
+        <w:tc>
+          <w:tcPr>
+            <w:tcW w:type="dxa" w:w="9360"/>
+            <w:shd w:fill="F2F4F7"/>
+            <w:tcMar>
+              <w:top w:w="110" w:type="dxa"/>
+              <w:left w:w="150" w:type="dxa"/>
+              <w:bottom w:w="110" w:type="dxa"/>
+              <w:right w:w="150" w:type="dxa"/>
+            </w:tcMar>
+          </w:tcPr>
+          <w:p>
+            <w:pPr>
+              <w:spacing w:after="0"/>
+            </w:pPr>
+            <w:r>
+              <w:rPr>
+                <w:rFonts w:ascii="Consolas" w:hAnsi="Consolas"/>
+                <w:color w:val="1F2937"/>
+                <w:sz w:val="17"/>
+              </w:rPr>
+              <w:t>ALLOWED_HOSTS=127.0.0.1,localhost,IP_DO_SERVIDOR,erp.exemplo.com.br</w:t>
+            </w:r>
+            <w:r>
+              <w:br/>
+            </w:r>
+            <w:r>
+              <w:rPr>
+                <w:rFonts w:ascii="Consolas" w:hAnsi="Consolas"/>
+                <w:color w:val="1F2937"/>
+                <w:sz w:val="17"/>
+              </w:rPr>
+              <w:t>CSRF_TRUSTED_ORIGINS=https://erp.exemplo.com.br</w:t>
+            </w:r>
+            <w:r>
+              <w:br/>
+            </w:r>
+            <w:r>
+              <w:rPr>
+                <w:rFonts w:ascii="Consolas" w:hAnsi="Consolas"/>
+                <w:color w:val="1F2937"/>
+                <w:sz w:val="17"/>
+              </w:rPr>
+              <w:t>USE_X_FORWARDED_PROTO=True</w:t>
+            </w:r>
+            <w:r>
+              <w:br/>
+            </w:r>
+            <w:r>
+              <w:rPr>
+                <w:rFonts w:ascii="Consolas" w:hAnsi="Consolas"/>
+                <w:color w:val="1F2937"/>
+                <w:sz w:val="17"/>
+              </w:rPr>
+              <w:t>SESSION_COOKIE_SECURE=True</w:t>
+            </w:r>
+            <w:r>
+              <w:br/>
+            </w:r>
+            <w:r>
+              <w:rPr>
+                <w:rFonts w:ascii="Consolas" w:hAnsi="Consolas"/>
+                <w:color w:val="1F2937"/>
+                <w:sz w:val="17"/>
+              </w:rPr>
+              <w:t>CSRF_COOKIE_SECURE=True</w:t>
+            </w:r>
+            <w:r>
+              <w:br/>
+            </w:r>
+            <w:r>
+              <w:rPr>
+                <w:rFonts w:ascii="Consolas" w:hAnsi="Consolas"/>
+                <w:color w:val="1F2937"/>
+                <w:sz w:val="17"/>
+              </w:rPr>
+              <w:t>SECURE_SSL_REDIRECT=False</w:t>
+            </w:r>
+            <w:r>
+              <w:br/>
+            </w:r>
+            <w:r>
+              <w:rPr>
+                <w:rFonts w:ascii="Consolas" w:hAnsi="Consolas"/>
+                <w:color w:val="1F2937"/>
+                <w:sz w:val="17"/>
+              </w:rPr>
+            </w:r>
+            <w:r>
+              <w:br/>
+            </w:r>
+            <w:r>
+              <w:rPr>
+                <w:rFonts w:ascii="Consolas" w:hAnsi="Consolas"/>
+                <w:color w:val="1F2937"/>
+                <w:sz w:val="17"/>
+              </w:rPr>
+              <w:t>Restart-Service DeigoVarejoServidorLocal</w:t>
+            </w:r>
+          </w:p>
+        </w:tc>
+      </w:tr>
+    </w:tbl>
+    <w:p>
+      <w:pPr>
+        <w:spacing w:after="0"/>
+      </w:pPr>
+    </w:p>
+    <w:tbl>
+      <w:tblPr>
+        <w:tblW w:type="dxa" w:w="9360"/>
+        <w:jc w:val="center"/>
+        <w:tblLayout w:type="fixed"/>
+        <w:tblLook w:firstColumn="1" w:firstRow="1" w:lastColumn="0" w:lastRow="0" w:noHBand="0" w:noVBand="1" w:val="04A0"/>
+      </w:tblPr>
+      <w:tblGrid>
+        <w:gridCol w:w="9360"/>
+      </w:tblGrid>
+      <w:tr>
+        <w:tc>
+          <w:tcPr>
+            <w:tcW w:type="dxa" w:w="9360"/>
+            <w:shd w:fill="FDECEC"/>
+            <w:tcMar>
+              <w:top w:w="130" w:type="dxa"/>
+              <w:left w:w="170" w:type="dxa"/>
+              <w:bottom w:w="130" w:type="dxa"/>
+              <w:right w:w="170" w:type="dxa"/>
+            </w:tcMar>
+          </w:tcPr>
+          <w:p>
+            <w:r>
+              <w:rPr>
+                <w:b/>
+                <w:color w:val="B42318"/>
+              </w:rPr>
+              <w:t>Redirecionamento HTTPS</w:t>
+              <w:br/>
+            </w:r>
+            <w:r>
+              <w:rPr>
+                <w:color w:val="26364A"/>
+              </w:rPr>
+              <w:t>Neste modelo, o proxy faz o redirecionamento HTTP para HTTPS. O PostgreSQL permanece restrito ao servidor e a porta 5432 nunca deve ser aberta na rede ou na internet.</w:t>
+            </w:r>
+          </w:p>
+        </w:tc>
+      </w:tr>
+    </w:tbl>
+    <w:p>
+      <w:pPr>
+        <w:spacing w:after="0"/>
+      </w:pPr>
+    </w:p>
+    <w:p>
       <w:r>
         <w:br w:type="page"/>
       </w:r>

</xml_diff>

<commit_message>
docs: corrige acesso do servidor pela rede local
</commit_message>
<xml_diff>
--- a/docs/manuais/manual_operacao_servidor_detec.docx
+++ b/docs/manuais/manual_operacao_servidor_detec.docx
@@ -1401,7 +1401,7 @@
     </w:p>
     <w:p>
       <w:r>
-        <w:t>Execute como administrador e substitua Ethernet pelo nome real do adaptador, quando necessário. Use somente o IPv4 privado do adaptador com gateway; ignore Loopback, VPN, TEF e adaptadores fiscais.</w:t>
+        <w:t>Execute como administrador. O comando seleciona o adaptador ativo com gateway e exibe o IPv4 privado da rede; adaptadores sem rota padrão, como Loopback, VPN, TEF e fiscais, ficam fora da seleção.</w:t>
       </w:r>
     </w:p>
     <w:tbl>
@@ -1436,7 +1436,7 @@
                 <w:color w:val="1F2937"/>
                 <w:sz w:val="17"/>
               </w:rPr>
-              <w:t>$interface = "Ethernet"</w:t>
+              <w:t>$porta = 8001</w:t>
             </w:r>
             <w:r>
               <w:br/>
@@ -1447,7 +1447,51 @@
                 <w:color w:val="1F2937"/>
                 <w:sz w:val="17"/>
               </w:rPr>
-              <w:t>$porta = 8001</w:t>
+              <w:t>$configRede = Get-NetIPConfiguration | Where-Object { $_.NetAdapter.Status -eq 'Up' -and $_.IPv4DefaultGateway -and $_.IPv4Address } | Select-Object -First 1</w:t>
+            </w:r>
+            <w:r>
+              <w:br/>
+            </w:r>
+            <w:r>
+              <w:rPr>
+                <w:rFonts w:ascii="Consolas" w:hAnsi="Consolas"/>
+                <w:color w:val="1F2937"/>
+                <w:sz w:val="17"/>
+              </w:rPr>
+              <w:t>$interface = $configRede.InterfaceAlias</w:t>
+            </w:r>
+            <w:r>
+              <w:br/>
+            </w:r>
+            <w:r>
+              <w:rPr>
+                <w:rFonts w:ascii="Consolas" w:hAnsi="Consolas"/>
+                <w:color w:val="1F2937"/>
+                <w:sz w:val="17"/>
+              </w:rPr>
+              <w:t>$ipServidor = $configRede.IPv4Address.IPAddress</w:t>
+            </w:r>
+            <w:r>
+              <w:br/>
+            </w:r>
+            <w:r>
+              <w:rPr>
+                <w:rFonts w:ascii="Consolas" w:hAnsi="Consolas"/>
+                <w:color w:val="1F2937"/>
+                <w:sz w:val="17"/>
+              </w:rPr>
+              <w:t>Write-Host "Interface: $interface"</w:t>
+            </w:r>
+            <w:r>
+              <w:br/>
+            </w:r>
+            <w:r>
+              <w:rPr>
+                <w:rFonts w:ascii="Consolas" w:hAnsi="Consolas"/>
+                <w:color w:val="1F2937"/>
+                <w:sz w:val="17"/>
+              </w:rPr>
+              <w:t>Write-Host "IP do servidor: $ipServidor"</w:t>
             </w:r>
             <w:r>
               <w:br/>
@@ -1515,6 +1559,17 @@
               </w:rPr>
               <w:t>Get-Service DeigoVarejoServidorLocal</w:t>
             </w:r>
+            <w:r>
+              <w:br/>
+            </w:r>
+            <w:r>
+              <w:rPr>
+                <w:rFonts w:ascii="Consolas" w:hAnsi="Consolas"/>
+                <w:color w:val="1F2937"/>
+                <w:sz w:val="17"/>
+              </w:rPr>
+              <w:t>Invoke-WebRequest "http://${ipServidor}:$porta/login/" -UseBasicParsing</w:t>
+            </w:r>
           </w:p>
         </w:tc>
       </w:tr>
@@ -1526,7 +1581,7 @@
     </w:p>
     <w:p>
       <w:r>
-        <w:t>Teste primeiro no servidor e depois em outro computador da mesma rede:</w:t>
+        <w:t>No outro computador, copie o número exibido em IP do servidor. O exemplo abaixo usa 192.168.2.65; substitua-o pelo endereço real da loja:</w:t>
       </w:r>
     </w:p>
     <w:tbl>
@@ -1561,7 +1616,7 @@
                 <w:color w:val="1F2937"/>
                 <w:sz w:val="17"/>
               </w:rPr>
-              <w:t>Invoke-WebRequest http://IP_DO_SERVIDOR:8001/login/ -UseBasicParsing</w:t>
+              <w:t>$ipServidor = "192.168.2.65"</w:t>
             </w:r>
             <w:r>
               <w:br/>
@@ -1572,7 +1627,53 @@
                 <w:color w:val="1F2937"/>
                 <w:sz w:val="17"/>
               </w:rPr>
-              <w:t>Test-NetConnection IP_DO_SERVIDOR -Port 8001</w:t>
+              <w:t>Test-NetConnection $ipServidor -Port 8001</w:t>
+            </w:r>
+          </w:p>
+        </w:tc>
+      </w:tr>
+    </w:tbl>
+    <w:p>
+      <w:pPr>
+        <w:spacing w:after="0"/>
+      </w:pPr>
+    </w:p>
+    <w:tbl>
+      <w:tblPr>
+        <w:tblW w:type="dxa" w:w="9360"/>
+        <w:jc w:val="center"/>
+        <w:tblLayout w:type="fixed"/>
+        <w:tblLook w:firstColumn="1" w:firstRow="1" w:lastColumn="0" w:lastRow="0" w:noHBand="0" w:noVBand="1" w:val="04A0"/>
+      </w:tblPr>
+      <w:tblGrid>
+        <w:gridCol w:w="9360"/>
+      </w:tblGrid>
+      <w:tr>
+        <w:tc>
+          <w:tcPr>
+            <w:tcW w:type="dxa" w:w="9360"/>
+            <w:shd w:fill="FFF4E5"/>
+            <w:tcMar>
+              <w:top w:w="130" w:type="dxa"/>
+              <w:left w:w="170" w:type="dxa"/>
+              <w:bottom w:w="130" w:type="dxa"/>
+              <w:right w:w="170" w:type="dxa"/>
+            </w:tcMar>
+          </w:tcPr>
+          <w:p>
+            <w:r>
+              <w:rPr>
+                <w:b/>
+                <w:color w:val="A85A00"/>
+              </w:rPr>
+              <w:t>Marcador não é endereço</w:t>
+              <w:br/>
+            </w:r>
+            <w:r>
+              <w:rPr>
+                <w:color w:val="26364A"/>
+              </w:rPr>
+              <w:t>Nunca execute literalmente Test-NetConnection IP_DO_SERVIDOR. Esse texto era apenas um marcador; use o IPv4 numérico exibido pelo comando, como 192.168.2.65.</w:t>
             </w:r>
           </w:p>
         </w:tc>
@@ -1756,7 +1857,7 @@
                 <w:color w:val="1F2937"/>
                 <w:sz w:val="17"/>
               </w:rPr>
-              <w:t>ALLOWED_HOSTS=127.0.0.1,localhost,IP_DO_SERVIDOR,erp.exemplo.com.br</w:t>
+              <w:t>ALLOWED_HOSTS=127.0.0.1,localhost,192.168.2.65,erp.exemplo.com.br  # substitua pelo IPv4 privado real</w:t>
             </w:r>
             <w:r>
               <w:br/>

</xml_diff>